<commit_message>
historical-verifier 패스 실행(2026-07-17) · 원문 미생성 원칙 준수
- references/historical-verification-2026-07-17.md 신규: 검증 리포트
  · [H]태그 인용 0건(사료 최소화 준수)·소설/드라마/위키 오인용 0건
  · 국가DB 접근성 확인(한국고전번역원 db.itkc.or.kr 실재 확인 / KTKP·현충사 자동접근 차단→수동)
  · 배경 사실 8건 서지수준 [확립] 확인 + 정본 DB 위치 제시 · 원문(편명/일자/한자/page)은 [미완, 수동 대조]
  · 주의: 개심산 출전 판본별 상이(H-7) → 확정 인용 시 판본 명기
  · 할루시네이션 방지: 원문·page·일자 미생성
- appendices/appendix-A: 각 항목 [확립]/[원문 미완] 상태 반영 + 리포트 링크
- chapters/ch02: 사료 검증 헤더에 패스 실행일·결과 기록
- output: 리포트·부록A·ch02·통합본 docx 재생성

Co-Authored-By: Claude Opus 4.8 (1M context) <noreply@anthropic.com>
</commit_message>
<xml_diff>
--- a/output/ch02-joseon-yi-sunsin.docx
+++ b/output/ch02-joseon-yi-sunsin.docx
@@ -72,19 +72,32 @@
         <w:rPr>
           <w:rFonts w:ascii="Malgun Gothic" w:hAnsi="Malgun Gothic" w:eastAsia="Malgun Gothic"/>
         </w:rPr>
-        <w:t xml:space="preserve"> — 조선 사료(난중일기·동의보감·조선왕조실록)는 논쟁의 여지 없는 사실(존재·저자·연대)만 배경으로 언급하며, 특정 일자·구절·페이지의 확정 인용은 하지 않는다. 심층 사료 인용이 필요한 경우 </w:t>
+        <w:t xml:space="preserve"> — 조선 사료(난중일기·동의보감·조선왕조실록)는 논쟁의 여지 없는 사실(존재·저자·연대)만 배경으로 언급하며, 특정 일자·구절·페이지의 확정 인용은 하지 않는다. </w:t>
+      </w:r>
+      <w:r>
+        <w:rPr>
+          <w:rFonts w:ascii="Malgun Gothic" w:hAnsi="Malgun Gothic" w:eastAsia="Malgun Gothic"/>
+          <w:b/>
+        </w:rPr>
+        <w:t>historical-verifier 패스 2026-07-17 실행</w:t>
       </w:r>
       <w:r>
         <w:rPr>
           <w:rFonts w:ascii="Malgun Gothic" w:hAnsi="Malgun Gothic" w:eastAsia="Malgun Gothic"/>
         </w:rPr>
-        <w:t>[HISTORICAL-VERIFY-PENDING]</w:t>
+        <w:t xml:space="preserve"> — [H]태그 인용 0건·소설/드라마 오인용 0건 확인, 배경 서지 사실 [확립], 원문 확정 인용은 [미완, 수동 대조]로 이월(리포트: </w:t>
       </w:r>
       <w:r>
         <w:rPr>
           <w:rFonts w:ascii="Malgun Gothic" w:hAnsi="Malgun Gothic" w:eastAsia="Malgun Gothic"/>
         </w:rPr>
-        <w:t>으로 표시하고 historical-verifier 전용 패스에서 확정한다. 소설·드라마 인용 0.</w:t>
+        <w:t>references/historical-verification-2026-07-17.md</w:t>
+      </w:r>
+      <w:r>
+        <w:rPr>
+          <w:rFonts w:ascii="Malgun Gothic" w:hAnsi="Malgun Gothic" w:eastAsia="Malgun Gothic"/>
+        </w:rPr>
+        <w:t>, 부록 A). 소설·드라마 인용 0.</w:t>
       </w:r>
     </w:p>
     <w:p>

</xml_diff>